<commit_message>
refresh the supplementary bundle example and DOCX for version 2.1.0
</commit_message>
<xml_diff>
--- a/dev/supplementary/output/TMA_Supplementary.docx
+++ b/dev/supplementary/output/TMA_Supplementary.docx
@@ -128,7 +128,7 @@
         <w:t xml:space="preserve">NOT_CRAN=true Rscript dev/supplementary/run_all.R</w:t>
       </w:r>
       <w:r>
-        <w:t xml:space="preserve">. Software: R 4.6.1; TranscriptMetaAnalyst 2.0.0; DESeq2 1.52.0; limma 3.68.5; edgeR 4.10.7. The test suite of the package has 822 testthat expectations in 161 tests (0 failed).</w:t>
+        <w:t xml:space="preserve">. Software: R 4.6.1; TranscriptMetaAnalyst 2.1.0; DESeq2 1.52.0; limma 3.68.5; edgeR 4.10.7. Sections S1–S4 were computed with the same code before its version number was raised from 2.0.0 to 2.1.0 (R 4.6.1; TranscriptMetaAnalyst 2.0.0; DESeq2 1.52.0; limma 3.68.5; edgeR 4.10.7). The test suite of the package has 822 testthat expectations in 161 tests (0 failed).</w:t>
       </w:r>
     </w:p>
     <w:bookmarkStart w:id="23" w:name="s1.-batch-effect-case-study"/>
@@ -8237,7 +8237,7 @@
         <w:t xml:space="preserve"> </w:t>
       </w:r>
       <w:r>
-        <w:t xml:space="preserve">took 11.6 s and reproduced all 6 result tables of the run exactly (6 of 6 byte-identical).</w:t>
+        <w:t xml:space="preserve">took 11.5 s and reproduced all 6 result tables of the run exactly (6 of 6 byte-identical).</w:t>
       </w:r>
     </w:p>
     <w:p>
@@ -8812,7 +8812,7 @@
         <w:rPr>
           <w:rStyle w:val="VerbatimChar"/>
         </w:rPr>
-        <w:t xml:space="preserve">This folder repeats an RNA-Seq meta-analysis made with TranscriptMetaAnalyst (TMA) 2.0.0, on the demo data bundled with TranscriptMetaAnalyst, with every setting of the run.</w:t>
+        <w:t xml:space="preserve">This folder repeats an RNA-Seq meta-analysis made with TranscriptMetaAnalyst (TMA) 2.1.0, on the demo data bundled with TranscriptMetaAnalyst, with every setting of the run.</w:t>
       </w:r>
       <w:r>
         <w:br/>
@@ -8864,7 +8864,7 @@
         <w:rPr>
           <w:rStyle w:val="VerbatimChar"/>
         </w:rPr>
-        <w:t xml:space="preserve">Expected run time: about 1 minute (the analysis took 4 s in the app; saving the figures adds a little).</w:t>
+        <w:t xml:space="preserve">Expected run time: about 1 minute (the analysis took 3 s in the app; saving the figures adds a little).</w:t>
       </w:r>
       <w:r>
         <w:br/>

</xml_diff>